<commit_message>
Corrigir campos duplicados e geracao Word PDF
</commit_message>
<xml_diff>
--- a/modelos/Autodeclara#U00d4#U00f6#U00a3#U252c#U2551#U00d4#U00f6#U00a3#U251c#U2551o - COM REPRESENTA#U00d4#U00f6#U00a3#U251c#U00ba#U00d4#U00f6#U00a3#U251c#U00f3O.docx
+++ b/modelos/Autodeclara#U00d4#U00f6#U00a3#U252c#U2551#U00d4#U00f6#U00a3#U251c#U2551o - COM REPRESENTA#U00d4#U00f6#U00a3#U251c#U00ba#U00d4#U00f6#U00a3#U251c#U00f3O.docx
@@ -448,7 +448,7 @@
           </mc:Choice>
           <mc:Fallback>
             <w:pict>
-              <v:line w14:anchorId="13F7AA3A" id="Line 3" o:spid="_x0000_s1026" style="position:absolute;z-index:-251658240;visibility:visible;mso-wrap-style:square;mso-width-percent:0;mso-height-percent:0;mso-wrap-distance-left:0;mso-wrap-distance-top:0;mso-wrap-distance-right:0;mso-wrap-distance-bottom:0;mso-position-horizontal:absolute;mso-position-horizontal-relative:page;mso-position-vertical:absolute;mso-position-vertical-relative:text;mso-width-percent:0;mso-height-percent:0;mso-width-relative:page;mso-height-relative:page" from="207.55pt,13.1pt" to="387.75pt,13.1pt" o:gfxdata="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" strokecolor="#323232" strokeweight=".20003mm">
+              <v:line w14:anchorId="7D27C071" id="Line 3" o:spid="_x0000_s1026" style="position:absolute;z-index:-251658240;visibility:visible;mso-wrap-style:square;mso-width-percent:0;mso-height-percent:0;mso-wrap-distance-left:0;mso-wrap-distance-top:0;mso-wrap-distance-right:0;mso-wrap-distance-bottom:0;mso-position-horizontal:absolute;mso-position-horizontal-relative:page;mso-position-vertical:absolute;mso-position-vertical-relative:text;mso-width-percent:0;mso-height-percent:0;mso-width-relative:page;mso-height-relative:page" from="207.55pt,13.1pt" to="387.75pt,13.1pt" o:gfxdata="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" strokecolor="#323232" strokeweight=".20003mm">
                 <w10:wrap type="topAndBottom" anchorx="page"/>
               </v:line>
             </w:pict>
@@ -719,7 +719,7 @@
           </mc:Choice>
           <mc:Fallback>
             <w:pict>
-              <v:line w14:anchorId="7119BE52" id="Line 2" o:spid="_x0000_s1026" style="position:absolute;z-index:-251657216;visibility:visible;mso-wrap-style:square;mso-width-percent:0;mso-height-percent:0;mso-wrap-distance-left:0;mso-wrap-distance-top:0;mso-wrap-distance-right:0;mso-wrap-distance-bottom:0;mso-position-horizontal:absolute;mso-position-horizontal-relative:page;mso-position-vertical:absolute;mso-position-vertical-relative:text;mso-width-percent:0;mso-height-percent:0;mso-width-relative:page;mso-height-relative:page" from="207.55pt,11.75pt" to="387.75pt,11.75pt" o:gfxdata="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" strokecolor="#323232" strokeweight=".20003mm">
+              <v:line w14:anchorId="7E0CBE5C" id="Line 2" o:spid="_x0000_s1026" style="position:absolute;z-index:-251657216;visibility:visible;mso-wrap-style:square;mso-width-percent:0;mso-height-percent:0;mso-wrap-distance-left:0;mso-wrap-distance-top:0;mso-wrap-distance-right:0;mso-wrap-distance-bottom:0;mso-position-horizontal:absolute;mso-position-horizontal-relative:page;mso-position-vertical:absolute;mso-position-vertical-relative:text;mso-width-percent:0;mso-height-percent:0;mso-width-relative:page;mso-height-relative:page" from="207.55pt,11.75pt" to="387.75pt,11.75pt" o:gfxdata="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" strokecolor="#323232" strokeweight=".20003mm">
                 <w10:wrap type="topAndBottom" anchorx="page"/>
               </v:line>
             </w:pict>
@@ -11155,7 +11155,7 @@
               <v:stroke joinstyle="miter"/>
               <v:path gradientshapeok="t" o:connecttype="rect"/>
             </v:shapetype>
-            <v:shape id="Caixa de Texto 12" o:spid="_x0000_s1027" type="#_x0000_t202" style="position:absolute;margin-left:151.25pt;margin-top:812.2pt;width:316.7pt;height:14.4pt;z-index:-251656704;visibility:visible;mso-wrap-style:square;mso-width-percent:0;mso-height-percent:0;mso-wrap-distance-left:9pt;mso-wrap-distance-top:0;mso-wrap-distance-right:9pt;mso-wrap-distance-bottom:0;mso-position-horizontal:absolute;mso-position-horizontal-relative:page;mso-position-vertical:absolute;mso-position-vertical-relative:page;mso-width-percent:0;mso-height-percent:0;mso-width-relative:page;mso-height-relative:page;v-text-anchor:top" o:gfxdata="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" filled="f" stroked="f">
+            <v:shape id="Caixa de Texto 12" o:spid="_x0000_s1027" type="#_x0000_t202" style="position:absolute;margin-left:151.25pt;margin-top:812.2pt;width:316.7pt;height:14.4pt;z-index:-251656704;visibility:visible;mso-wrap-style:square;mso-width-percent:0;mso-height-percent:0;mso-wrap-distance-left:9pt;mso-wrap-distance-top:0;mso-wrap-distance-right:9pt;mso-wrap-distance-bottom:0;mso-position-horizontal:absolute;mso-position-horizontal-relative:page;mso-position-vertical:absolute;mso-position-vertical-relative:page;mso-width-percent:0;mso-height-percent:0;mso-width-relative:page;mso-height-relative:page;v-text-anchor:top" o:gfxdata="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" filled="f" stroked="f">
               <v:textbox inset="0,0,0,0">
                 <w:txbxContent>
                   <w:p>
@@ -11645,7 +11645,7 @@
               <v:stroke joinstyle="miter"/>
               <v:path gradientshapeok="t" o:connecttype="rect"/>
             </v:shapetype>
-            <v:shape id="Caixa de texto 2" o:spid="_x0000_s1026" type="#_x0000_t202" style="position:absolute;margin-left:202.3pt;margin-top:78.3pt;width:211.95pt;height:13.15pt;z-index:-251663360;visibility:visible;mso-wrap-style:square;mso-width-percent:0;mso-height-percent:0;mso-wrap-distance-left:9pt;mso-wrap-distance-top:0;mso-wrap-distance-right:9pt;mso-wrap-distance-bottom:0;mso-position-horizontal:absolute;mso-position-horizontal-relative:page;mso-position-vertical:absolute;mso-position-vertical-relative:page;mso-width-percent:0;mso-height-percent:0;mso-width-relative:page;mso-height-relative:page;v-text-anchor:top" o:gfxdata="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" filled="f" stroked="f">
+            <v:shape id="Caixa de texto 2" o:spid="_x0000_s1026" type="#_x0000_t202" style="position:absolute;margin-left:202.3pt;margin-top:78.3pt;width:211.95pt;height:13.15pt;z-index:-251663360;visibility:visible;mso-wrap-style:square;mso-width-percent:0;mso-height-percent:0;mso-wrap-distance-left:9pt;mso-wrap-distance-top:0;mso-wrap-distance-right:9pt;mso-wrap-distance-bottom:0;mso-position-horizontal:absolute;mso-position-horizontal-relative:page;mso-position-vertical:absolute;mso-position-vertical-relative:page;mso-width-percent:0;mso-height-percent:0;mso-width-relative:page;mso-height-relative:page;v-text-anchor:top" o:gfxdata="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" filled="f" stroked="f">
               <v:textbox inset="0,0,0,0">
                 <w:txbxContent>
                   <w:p>
@@ -11965,7 +11965,7 @@
               <v:stroke joinstyle="miter"/>
               <v:path gradientshapeok="t" o:connecttype="rect"/>
             </v:shapetype>
-            <v:shape id="_x0000_s1028" type="#_x0000_t202" style="position:absolute;margin-left:202.3pt;margin-top:78.3pt;width:211.95pt;height:13.15pt;z-index:-251654144;visibility:visible;mso-wrap-style:square;mso-width-percent:0;mso-height-percent:0;mso-wrap-distance-left:9pt;mso-wrap-distance-top:0;mso-wrap-distance-right:9pt;mso-wrap-distance-bottom:0;mso-position-horizontal:absolute;mso-position-horizontal-relative:page;mso-position-vertical:absolute;mso-position-vertical-relative:page;mso-width-percent:0;mso-height-percent:0;mso-width-relative:page;mso-height-relative:page;v-text-anchor:top" o:gfxdata="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" filled="f" stroked="f">
+            <v:shape id="_x0000_s1028" type="#_x0000_t202" style="position:absolute;margin-left:202.3pt;margin-top:78.3pt;width:211.95pt;height:13.15pt;z-index:-251654144;visibility:visible;mso-wrap-style:square;mso-width-percent:0;mso-height-percent:0;mso-wrap-distance-left:9pt;mso-wrap-distance-top:0;mso-wrap-distance-right:9pt;mso-wrap-distance-bottom:0;mso-position-horizontal:absolute;mso-position-horizontal-relative:page;mso-position-vertical:absolute;mso-position-vertical-relative:page;mso-width-percent:0;mso-height-percent:0;mso-width-relative:page;mso-height-relative:page;v-text-anchor:top" o:gfxdata="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" filled="f" stroked="f">
               <v:textbox inset="0,0,0,0">
                 <w:txbxContent>
                   <w:p>
@@ -12285,7 +12285,7 @@
               <v:stroke joinstyle="miter"/>
               <v:path gradientshapeok="t" o:connecttype="rect"/>
             </v:shapetype>
-            <v:shape id="_x0000_s1029" type="#_x0000_t202" style="position:absolute;margin-left:202.3pt;margin-top:78.3pt;width:211.95pt;height:13.15pt;z-index:-251646976;visibility:visible;mso-wrap-style:square;mso-width-percent:0;mso-height-percent:0;mso-wrap-distance-left:9pt;mso-wrap-distance-top:0;mso-wrap-distance-right:9pt;mso-wrap-distance-bottom:0;mso-position-horizontal:absolute;mso-position-horizontal-relative:page;mso-position-vertical:absolute;mso-position-vertical-relative:page;mso-width-percent:0;mso-height-percent:0;mso-width-relative:page;mso-height-relative:page;v-text-anchor:top" o:gfxdata="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" filled="f" stroked="f">
+            <v:shape id="_x0000_s1029" type="#_x0000_t202" style="position:absolute;margin-left:202.3pt;margin-top:78.3pt;width:211.95pt;height:13.15pt;z-index:-251646976;visibility:visible;mso-wrap-style:square;mso-width-percent:0;mso-height-percent:0;mso-wrap-distance-left:9pt;mso-wrap-distance-top:0;mso-wrap-distance-right:9pt;mso-wrap-distance-bottom:0;mso-position-horizontal:absolute;mso-position-horizontal-relative:page;mso-position-vertical:absolute;mso-position-vertical-relative:page;mso-width-percent:0;mso-height-percent:0;mso-width-relative:page;mso-height-relative:page;v-text-anchor:top" o:gfxdata="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" filled="f" stroked="f">
               <v:textbox inset="0,0,0,0">
                 <w:txbxContent>
                   <w:p>
@@ -12605,7 +12605,7 @@
               <v:stroke joinstyle="miter"/>
               <v:path gradientshapeok="t" o:connecttype="rect"/>
             </v:shapetype>
-            <v:shape id="_x0000_s1030" type="#_x0000_t202" style="position:absolute;margin-left:202.3pt;margin-top:78.3pt;width:211.95pt;height:13.15pt;z-index:-251640832;visibility:visible;mso-wrap-style:square;mso-width-percent:0;mso-height-percent:0;mso-wrap-distance-left:9pt;mso-wrap-distance-top:0;mso-wrap-distance-right:9pt;mso-wrap-distance-bottom:0;mso-position-horizontal:absolute;mso-position-horizontal-relative:page;mso-position-vertical:absolute;mso-position-vertical-relative:page;mso-width-percent:0;mso-height-percent:0;mso-width-relative:page;mso-height-relative:page;v-text-anchor:top" o:gfxdata="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" filled="f" stroked="f">
+            <v:shape id="_x0000_s1030" type="#_x0000_t202" style="position:absolute;margin-left:202.3pt;margin-top:78.3pt;width:211.95pt;height:13.15pt;z-index:-251640832;visibility:visible;mso-wrap-style:square;mso-width-percent:0;mso-height-percent:0;mso-wrap-distance-left:9pt;mso-wrap-distance-top:0;mso-wrap-distance-right:9pt;mso-wrap-distance-bottom:0;mso-position-horizontal:absolute;mso-position-horizontal-relative:page;mso-position-vertical:absolute;mso-position-vertical-relative:page;mso-width-percent:0;mso-height-percent:0;mso-width-relative:page;mso-height-relative:page;v-text-anchor:top" o:gfxdata="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" filled="f" stroked="f">
               <v:textbox inset="0,0,0,0">
                 <w:txbxContent>
                   <w:p>

</xml_diff>